<commit_message>
Update marketing stack to Shopify + HighLevel CRM; remove other platforms
</commit_message>
<xml_diff>
--- a/NoonShop_Growth_Marketer_Job_Description.docx
+++ b/NoonShop_Growth_Marketer_Job_Description.docx
@@ -454,7 +454,7 @@
         <w:spacing w:after="60"/>
       </w:pPr>
       <w:r>
-        <w:t xml:space="preserve">Platforms such as Klaviyo, Mailchimp, HubSpot, ActiveCampaign, Shopify Flow, Zapier, and Make.</w:t>
+        <w:t xml:space="preserve">Works within our stack: Shopify and HighLevel (GoHighLevel) CRM.</w:t>
       </w:r>
     </w:p>
     <w:p>
@@ -1438,7 +1438,7 @@
         <w:spacing w:after="140"/>
       </w:pPr>
       <w:r>
-        <w:t xml:space="preserve">Helpful experience with any of the following: Shopify, Google Analytics 4, Google Tag Manager, Google Ads, Meta Ads Manager, Microsoft Clarity, Hotjar, Klaviyo, Mailchimp, HubSpot, and marketing-automation platforms such as Zapier or Make.</w:t>
+        <w:t xml:space="preserve">Our core stack is Shopify and HighLevel (GoHighLevel) CRM. Helpful additional experience: Google Analytics 4, Google Tag Manager, Google Ads, Meta Ads Manager, Microsoft Clarity, and Hotjar.</w:t>
       </w:r>
     </w:p>
     <w:p>

</xml_diff>

<commit_message>
Add Qualifications section (required/preferred experience); remove apply link
</commit_message>
<xml_diff>
--- a/NoonShop_Growth_Marketer_Job_Description.docx
+++ b/NoonShop_Growth_Marketer_Job_Description.docx
@@ -1455,6 +1455,179 @@
           <w:bCs/>
           <w:color w:val="0F2747"/>
         </w:rPr>
+        <w:t xml:space="preserve">Qualifications</w:t>
+      </w:r>
+    </w:p>
+    <w:p>
+      <w:pPr>
+        <w:spacing w:after="60" w:before="120"/>
+      </w:pPr>
+      <w:r>
+        <w:rPr>
+          <w:b/>
+          <w:bCs/>
+          <w:color w:val="0F2747"/>
+        </w:rPr>
+        <w:t xml:space="preserve">Required</w:t>
+      </w:r>
+    </w:p>
+    <w:p>
+      <w:pPr>
+        <w:pStyle w:val="ListParagraph"/>
+        <w:numPr>
+          <w:ilvl w:val="0"/>
+          <w:numId w:val="2"/>
+        </w:numPr>
+        <w:spacing w:after="60"/>
+      </w:pPr>
+      <w:r>
+        <w:t xml:space="preserve">3+ years of hands-on digital or growth marketing experience, ideally for an ecommerce or direct-to-consumer brand.</w:t>
+      </w:r>
+    </w:p>
+    <w:p>
+      <w:pPr>
+        <w:pStyle w:val="ListParagraph"/>
+        <w:numPr>
+          <w:ilvl w:val="0"/>
+          <w:numId w:val="2"/>
+        </w:numPr>
+        <w:spacing w:after="60"/>
+      </w:pPr>
+      <w:r>
+        <w:t xml:space="preserve">Demonstrated experience managing paid acquisition campaigns (Google Ads and/or Meta) with accountability for ROAS and CAC.</w:t>
+      </w:r>
+    </w:p>
+    <w:p>
+      <w:pPr>
+        <w:pStyle w:val="ListParagraph"/>
+        <w:numPr>
+          <w:ilvl w:val="0"/>
+          <w:numId w:val="2"/>
+        </w:numPr>
+        <w:spacing w:after="60"/>
+      </w:pPr>
+      <w:r>
+        <w:t xml:space="preserve">Hands-on experience with Shopify and a CRM / marketing-automation platform.</w:t>
+      </w:r>
+    </w:p>
+    <w:p>
+      <w:pPr>
+        <w:pStyle w:val="ListParagraph"/>
+        <w:numPr>
+          <w:ilvl w:val="0"/>
+          <w:numId w:val="2"/>
+        </w:numPr>
+        <w:spacing w:after="60"/>
+      </w:pPr>
+      <w:r>
+        <w:t xml:space="preserve">Strong analytical skills; comfortable working in Google Analytics 4 and making decisions from performance data.</w:t>
+      </w:r>
+    </w:p>
+    <w:p>
+      <w:pPr>
+        <w:pStyle w:val="ListParagraph"/>
+        <w:numPr>
+          <w:ilvl w:val="0"/>
+          <w:numId w:val="2"/>
+        </w:numPr>
+        <w:spacing w:after="60"/>
+      </w:pPr>
+      <w:r>
+        <w:t xml:space="preserve">A track record of measurable results: improving conversion rates, reducing cart abandonment, or scaling qualified traffic.</w:t>
+      </w:r>
+    </w:p>
+    <w:p>
+      <w:pPr>
+        <w:spacing w:after="60" w:before="120"/>
+      </w:pPr>
+      <w:r>
+        <w:rPr>
+          <w:b/>
+          <w:bCs/>
+          <w:color w:val="0F2747"/>
+        </w:rPr>
+        <w:t xml:space="preserve">Preferred</w:t>
+      </w:r>
+    </w:p>
+    <w:p>
+      <w:pPr>
+        <w:pStyle w:val="ListParagraph"/>
+        <w:numPr>
+          <w:ilvl w:val="0"/>
+          <w:numId w:val="2"/>
+        </w:numPr>
+        <w:spacing w:after="60"/>
+      </w:pPr>
+      <w:r>
+        <w:t xml:space="preserve">Direct experience with HighLevel (GoHighLevel) CRM.</w:t>
+      </w:r>
+    </w:p>
+    <w:p>
+      <w:pPr>
+        <w:pStyle w:val="ListParagraph"/>
+        <w:numPr>
+          <w:ilvl w:val="0"/>
+          <w:numId w:val="2"/>
+        </w:numPr>
+        <w:spacing w:after="60"/>
+      </w:pPr>
+      <w:r>
+        <w:t xml:space="preserve">Ecommerce SEO experience (product and category page optimization).</w:t>
+      </w:r>
+    </w:p>
+    <w:p>
+      <w:pPr>
+        <w:pStyle w:val="ListParagraph"/>
+        <w:numPr>
+          <w:ilvl w:val="0"/>
+          <w:numId w:val="2"/>
+        </w:numPr>
+        <w:spacing w:after="60"/>
+      </w:pPr>
+      <w:r>
+        <w:t xml:space="preserve">Experience building retargeting campaigns and email/SMS automation flows.</w:t>
+      </w:r>
+    </w:p>
+    <w:p>
+      <w:pPr>
+        <w:pStyle w:val="ListParagraph"/>
+        <w:numPr>
+          <w:ilvl w:val="0"/>
+          <w:numId w:val="2"/>
+        </w:numPr>
+        <w:spacing w:after="60"/>
+      </w:pPr>
+      <w:r>
+        <w:t xml:space="preserve">Familiarity with CRO and heatmap tools such as Microsoft Clarity or Hotjar.</w:t>
+      </w:r>
+    </w:p>
+    <w:p>
+      <w:pPr>
+        <w:pStyle w:val="ListParagraph"/>
+        <w:numPr>
+          <w:ilvl w:val="0"/>
+          <w:numId w:val="2"/>
+        </w:numPr>
+        <w:spacing w:after="60"/>
+      </w:pPr>
+      <w:r>
+        <w:t xml:space="preserve">Experience setting up conversion tracking (Google Tag Manager, pixels, UTM parameters).</w:t>
+      </w:r>
+    </w:p>
+    <w:p>
+      <w:pPr>
+        <w:pStyle w:val="Heading1"/>
+        <w:pBdr>
+          <w:bottom w:val="single" w:color="0F2747" w:sz="6" w:space="4"/>
+        </w:pBdr>
+        <w:spacing w:after="160" w:before="320"/>
+      </w:pPr>
+      <w:r>
+        <w:rPr>
+          <w:b/>
+          <w:bCs/>
+          <w:color w:val="0F2747"/>
+        </w:rPr>
         <w:t xml:space="preserve">In One Sentence</w:t>
       </w:r>
     </w:p>
@@ -1476,52 +1649,6 @@
           <w:szCs w:val="24"/>
         </w:rPr>
         <w:t xml:space="preserve">We are looking for a growth-focused Internet Marketer who can attract visitors, understand their behavior, optimize their journey, recover lost opportunities, leverage technology and automation, and systematically turn traffic into revenue.</w:t>
-      </w:r>
-    </w:p>
-    <w:p>
-      <w:pPr>
-        <w:pStyle w:val="Heading1"/>
-        <w:pBdr>
-          <w:bottom w:val="single" w:color="0F2747" w:sz="6" w:space="4"/>
-        </w:pBdr>
-        <w:spacing w:after="160" w:before="320"/>
-      </w:pPr>
-      <w:r>
-        <w:rPr>
-          <w:b/>
-          <w:bCs/>
-          <w:color w:val="0F2747"/>
-        </w:rPr>
-        <w:t xml:space="preserve">How to Apply</w:t>
-      </w:r>
-    </w:p>
-    <w:p>
-      <w:pPr>
-        <w:spacing w:after="140"/>
-      </w:pPr>
-      <w:r>
-        <w:t xml:space="preserve">Tell us about a time you grew traffic or improved conversion for an ecommerce business, the metrics you moved, and how you did it. Include links to campaigns, dashboards, or results you are proud of.</w:t>
-      </w:r>
-    </w:p>
-    <w:p>
-      <w:pPr>
-        <w:spacing w:before="60"/>
-      </w:pPr>
-      <w:r>
-        <w:rPr>
-          <w:b/>
-          <w:bCs/>
-          <w:color w:val="0F2747"/>
-        </w:rPr>
-        <w:t xml:space="preserve">Apply: </w:t>
-      </w:r>
-      <w:r>
-        <w:rPr>
-          <w:i/>
-          <w:iCs/>
-          <w:color w:val="5B6677"/>
-        </w:rPr>
-        <w:t xml:space="preserve">[add your application email or link here]</w:t>
       </w:r>
     </w:p>
     <w:sectPr>

</xml_diff>

<commit_message>
Make all qualifications required; raise to 5+ years experience
</commit_message>
<xml_diff>
--- a/NoonShop_Growth_Marketer_Job_Description.docx
+++ b/NoonShop_Growth_Marketer_Job_Description.docx
@@ -1455,33 +1455,20 @@
           <w:bCs/>
           <w:color w:val="0F2747"/>
         </w:rPr>
-        <w:t xml:space="preserve">Qualifications</w:t>
-      </w:r>
-    </w:p>
-    <w:p>
-      <w:pPr>
-        <w:spacing w:after="60" w:before="120"/>
-      </w:pPr>
-      <w:r>
-        <w:rPr>
-          <w:b/>
-          <w:bCs/>
-          <w:color w:val="0F2747"/>
-        </w:rPr>
-        <w:t xml:space="preserve">Required</w:t>
-      </w:r>
-    </w:p>
-    <w:p>
-      <w:pPr>
-        <w:pStyle w:val="ListParagraph"/>
-        <w:numPr>
-          <w:ilvl w:val="0"/>
-          <w:numId w:val="2"/>
-        </w:numPr>
-        <w:spacing w:after="60"/>
-      </w:pPr>
-      <w:r>
-        <w:t xml:space="preserve">3+ years of hands-on digital or growth marketing experience, ideally for an ecommerce or direct-to-consumer brand.</w:t>
+        <w:t xml:space="preserve">Required Qualifications</w:t>
+      </w:r>
+    </w:p>
+    <w:p>
+      <w:pPr>
+        <w:pStyle w:val="ListParagraph"/>
+        <w:numPr>
+          <w:ilvl w:val="0"/>
+          <w:numId w:val="2"/>
+        </w:numPr>
+        <w:spacing w:after="60"/>
+      </w:pPr>
+      <w:r>
+        <w:t xml:space="preserve">5+ years of hands-on digital or growth marketing experience, ideally for an ecommerce or direct-to-consumer brand.</w:t>
       </w:r>
     </w:p>
     <w:p>
@@ -1534,19 +1521,6 @@
       </w:pPr>
       <w:r>
         <w:t xml:space="preserve">A track record of measurable results: improving conversion rates, reducing cart abandonment, or scaling qualified traffic.</w:t>
-      </w:r>
-    </w:p>
-    <w:p>
-      <w:pPr>
-        <w:spacing w:after="60" w:before="120"/>
-      </w:pPr>
-      <w:r>
-        <w:rPr>
-          <w:b/>
-          <w:bCs/>
-          <w:color w:val="0F2747"/>
-        </w:rPr>
-        <w:t xml:space="preserve">Preferred</w:t>
       </w:r>
     </w:p>
     <w:p>

</xml_diff>